<commit_message>
Updated the internal interface in the SRS
</commit_message>
<xml_diff>
--- a/Requirements/Communications SRS.docx
+++ b/Requirements/Communications SRS.docx
@@ -2022,7 +2022,7 @@
           <w:tcPr>
             <w:tcW w:w="1455" w:type="dxa"/>
             <w:tcBorders>
-              <w:top w:val="nil"/>
+              <w:top w:val="single" w:sz="8" w:space="0" w:color="000000"/>
               <w:left w:val="single" w:sz="8" w:space="0" w:color="000000"/>
               <w:bottom w:val="single" w:sz="8" w:space="0" w:color="000000"/>
               <w:right w:val="nil"/>
@@ -2069,7 +2069,7 @@
           <w:tcPr>
             <w:tcW w:w="1245" w:type="dxa"/>
             <w:tcBorders>
-              <w:top w:val="nil"/>
+              <w:top w:val="single" w:sz="8" w:space="0" w:color="000000"/>
               <w:left w:val="single" w:sz="8" w:space="0" w:color="000000"/>
               <w:bottom w:val="single" w:sz="8" w:space="0" w:color="000000"/>
               <w:right w:val="nil"/>
@@ -2107,7 +2107,7 @@
           <w:tcPr>
             <w:tcW w:w="3555" w:type="dxa"/>
             <w:tcBorders>
-              <w:top w:val="nil"/>
+              <w:top w:val="single" w:sz="8" w:space="0" w:color="000000"/>
               <w:left w:val="single" w:sz="8" w:space="0" w:color="000000"/>
               <w:bottom w:val="single" w:sz="8" w:space="0" w:color="000000"/>
               <w:right w:val="nil"/>
@@ -2161,7 +2161,7 @@
           <w:tcPr>
             <w:tcW w:w="2490" w:type="dxa"/>
             <w:tcBorders>
-              <w:top w:val="nil"/>
+              <w:top w:val="single" w:sz="8" w:space="0" w:color="000000"/>
               <w:left w:val="single" w:sz="8" w:space="0" w:color="000000"/>
               <w:bottom w:val="single" w:sz="8" w:space="0" w:color="000000"/>
               <w:right w:val="single" w:sz="8" w:space="0" w:color="000000"/>
@@ -2174,6 +2174,159 @@
               <w:right w:w="100" w:type="dxa"/>
             </w:tcMar>
             <w:hideMark/>
+          </w:tcPr>
+          <w:p>
+            <w:pPr>
+              <w:spacing w:before="40" w:after="40"/>
+              <w:ind w:left="-120"/>
+              <w:rPr>
+                <w:rFonts w:ascii="Times New Roman" w:eastAsia="Times New Roman" w:hAnsi="Times New Roman" w:cs="Times New Roman"/>
+                <w:sz w:val="20"/>
+                <w:szCs w:val="20"/>
+              </w:rPr>
+            </w:pPr>
+            <w:r>
+              <w:rPr>
+                <w:rFonts w:ascii="Times New Roman" w:eastAsia="Times New Roman" w:hAnsi="Times New Roman" w:cs="Times New Roman"/>
+                <w:sz w:val="20"/>
+                <w:szCs w:val="20"/>
+              </w:rPr>
+              <w:t xml:space="preserve"> Shea Pettit</w:t>
+            </w:r>
+          </w:p>
+        </w:tc>
+      </w:tr>
+      <w:tr>
+        <w:trPr>
+          <w:trHeight w:val="330"/>
+        </w:trPr>
+        <w:tc>
+          <w:tcPr>
+            <w:tcW w:w="1455" w:type="dxa"/>
+            <w:tcBorders>
+              <w:top w:val="single" w:sz="8" w:space="0" w:color="000000"/>
+              <w:left w:val="single" w:sz="8" w:space="0" w:color="000000"/>
+              <w:bottom w:val="single" w:sz="8" w:space="0" w:color="000000"/>
+              <w:right w:val="nil"/>
+            </w:tcBorders>
+            <w:shd w:val="clear" w:color="auto" w:fill="E5E5E5"/>
+            <w:tcMar>
+              <w:top w:w="0" w:type="dxa"/>
+              <w:left w:w="100" w:type="dxa"/>
+              <w:bottom w:w="0" w:type="dxa"/>
+              <w:right w:w="100" w:type="dxa"/>
+            </w:tcMar>
+          </w:tcPr>
+          <w:p>
+            <w:pPr>
+              <w:spacing w:before="40" w:after="40"/>
+              <w:ind w:left="-120"/>
+              <w:rPr>
+                <w:rFonts w:ascii="Times New Roman" w:eastAsia="Times New Roman" w:hAnsi="Times New Roman" w:cs="Times New Roman"/>
+                <w:sz w:val="20"/>
+                <w:szCs w:val="20"/>
+              </w:rPr>
+            </w:pPr>
+            <w:r>
+              <w:rPr>
+                <w:rFonts w:ascii="Times New Roman" w:eastAsia="Times New Roman" w:hAnsi="Times New Roman" w:cs="Times New Roman"/>
+                <w:sz w:val="20"/>
+                <w:szCs w:val="20"/>
+              </w:rPr>
+              <w:t xml:space="preserve"> 04/15/2026</w:t>
+            </w:r>
+          </w:p>
+        </w:tc>
+        <w:tc>
+          <w:tcPr>
+            <w:tcW w:w="1245" w:type="dxa"/>
+            <w:tcBorders>
+              <w:top w:val="single" w:sz="8" w:space="0" w:color="000000"/>
+              <w:left w:val="single" w:sz="8" w:space="0" w:color="000000"/>
+              <w:bottom w:val="single" w:sz="8" w:space="0" w:color="000000"/>
+              <w:right w:val="nil"/>
+            </w:tcBorders>
+            <w:shd w:val="clear" w:color="auto" w:fill="E5E5E5"/>
+            <w:tcMar>
+              <w:top w:w="0" w:type="dxa"/>
+              <w:left w:w="100" w:type="dxa"/>
+              <w:bottom w:w="0" w:type="dxa"/>
+              <w:right w:w="100" w:type="dxa"/>
+            </w:tcMar>
+          </w:tcPr>
+          <w:p>
+            <w:pPr>
+              <w:spacing w:before="40" w:after="40"/>
+              <w:ind w:left="-120"/>
+              <w:rPr>
+                <w:rFonts w:ascii="Times New Roman" w:eastAsia="Times New Roman" w:hAnsi="Times New Roman" w:cs="Times New Roman"/>
+                <w:sz w:val="20"/>
+                <w:szCs w:val="20"/>
+              </w:rPr>
+            </w:pPr>
+            <w:r>
+              <w:rPr>
+                <w:rFonts w:ascii="Times New Roman" w:eastAsia="Times New Roman" w:hAnsi="Times New Roman" w:cs="Times New Roman"/>
+                <w:sz w:val="20"/>
+                <w:szCs w:val="20"/>
+              </w:rPr>
+              <w:t xml:space="preserve"> 3.1</w:t>
+            </w:r>
+          </w:p>
+        </w:tc>
+        <w:tc>
+          <w:tcPr>
+            <w:tcW w:w="3555" w:type="dxa"/>
+            <w:tcBorders>
+              <w:top w:val="single" w:sz="8" w:space="0" w:color="000000"/>
+              <w:left w:val="single" w:sz="8" w:space="0" w:color="000000"/>
+              <w:bottom w:val="single" w:sz="8" w:space="0" w:color="000000"/>
+              <w:right w:val="nil"/>
+            </w:tcBorders>
+            <w:shd w:val="clear" w:color="auto" w:fill="E5E5E5"/>
+            <w:tcMar>
+              <w:top w:w="0" w:type="dxa"/>
+              <w:left w:w="100" w:type="dxa"/>
+              <w:bottom w:w="0" w:type="dxa"/>
+              <w:right w:w="100" w:type="dxa"/>
+            </w:tcMar>
+          </w:tcPr>
+          <w:p>
+            <w:pPr>
+              <w:spacing w:before="40" w:after="40"/>
+              <w:ind w:left="-120"/>
+              <w:rPr>
+                <w:rFonts w:ascii="Times New Roman" w:eastAsia="Times New Roman" w:hAnsi="Times New Roman" w:cs="Times New Roman"/>
+                <w:sz w:val="20"/>
+                <w:szCs w:val="20"/>
+              </w:rPr>
+            </w:pPr>
+            <w:r>
+              <w:rPr>
+                <w:rFonts w:ascii="Times New Roman" w:eastAsia="Times New Roman" w:hAnsi="Times New Roman" w:cs="Times New Roman"/>
+                <w:sz w:val="20"/>
+                <w:szCs w:val="20"/>
+              </w:rPr>
+              <w:t xml:space="preserve"> Updated SRS from design changes</w:t>
+            </w:r>
+          </w:p>
+        </w:tc>
+        <w:tc>
+          <w:tcPr>
+            <w:tcW w:w="2490" w:type="dxa"/>
+            <w:tcBorders>
+              <w:top w:val="single" w:sz="8" w:space="0" w:color="000000"/>
+              <w:left w:val="single" w:sz="8" w:space="0" w:color="000000"/>
+              <w:bottom w:val="single" w:sz="8" w:space="0" w:color="000000"/>
+              <w:right w:val="single" w:sz="8" w:space="0" w:color="000000"/>
+            </w:tcBorders>
+            <w:shd w:val="clear" w:color="auto" w:fill="E5E5E5"/>
+            <w:tcMar>
+              <w:top w:w="0" w:type="dxa"/>
+              <w:left w:w="100" w:type="dxa"/>
+              <w:bottom w:w="0" w:type="dxa"/>
+              <w:right w:w="100" w:type="dxa"/>
+            </w:tcMar>
           </w:tcPr>
           <w:p>
             <w:pPr>
@@ -7476,7 +7629,7 @@
           <w:szCs w:val="20"/>
           <w:lang w:eastAsia="zh-CN"/>
         </w:rPr>
-        <w:t xml:space="preserve">. </w:t>
+        <w:t>.</w:t>
       </w:r>
     </w:p>
     <w:p>
@@ -8266,6 +8419,78 @@
           <w:lang w:eastAsia="zh-CN"/>
         </w:rPr>
         <w:t xml:space="preserve"> with read-only access interface.</w:t>
+      </w:r>
+    </w:p>
+    <w:p>
+      <w:pPr>
+        <w:pStyle w:val="ListParagraph"/>
+        <w:numPr>
+          <w:ilvl w:val="2"/>
+          <w:numId w:val="1"/>
+        </w:numPr>
+        <w:ind w:firstLineChars="0"/>
+        <w:rPr>
+          <w:rFonts w:ascii="Times New Roman" w:hAnsi="Times New Roman" w:cs="Times New Roman"/>
+          <w:sz w:val="20"/>
+          <w:szCs w:val="20"/>
+        </w:rPr>
+      </w:pPr>
+      <w:r>
+        <w:rPr>
+          <w:rFonts w:ascii="Times New Roman" w:hAnsi="Times New Roman" w:cs="Times New Roman"/>
+          <w:sz w:val="20"/>
+          <w:szCs w:val="20"/>
+          <w:lang w:eastAsia="zh-CN"/>
+        </w:rPr>
+        <w:t>Communication between the CSM and the 3 client modules will be done through a message object</w:t>
+      </w:r>
+    </w:p>
+    <w:p>
+      <w:pPr>
+        <w:pStyle w:val="ListParagraph"/>
+        <w:numPr>
+          <w:ilvl w:val="2"/>
+          <w:numId w:val="1"/>
+        </w:numPr>
+        <w:ind w:firstLineChars="0"/>
+        <w:rPr>
+          <w:rFonts w:ascii="Times New Roman" w:hAnsi="Times New Roman" w:cs="Times New Roman"/>
+          <w:sz w:val="20"/>
+          <w:szCs w:val="20"/>
+        </w:rPr>
+      </w:pPr>
+      <w:r>
+        <w:rPr>
+          <w:rFonts w:ascii="Times New Roman" w:hAnsi="Times New Roman" w:cs="Times New Roman"/>
+          <w:sz w:val="20"/>
+          <w:szCs w:val="20"/>
+          <w:lang w:eastAsia="zh-CN"/>
+        </w:rPr>
+        <w:t>The message object contains the type of communication, and the necessary data to use the public interface of the module the message is sent to</w:t>
+      </w:r>
+    </w:p>
+    <w:p>
+      <w:pPr>
+        <w:pStyle w:val="ListParagraph"/>
+        <w:numPr>
+          <w:ilvl w:val="2"/>
+          <w:numId w:val="1"/>
+        </w:numPr>
+        <w:ind w:firstLineChars="0"/>
+        <w:rPr>
+          <w:rFonts w:ascii="Times New Roman" w:hAnsi="Times New Roman" w:cs="Times New Roman"/>
+          <w:sz w:val="20"/>
+          <w:szCs w:val="20"/>
+        </w:rPr>
+      </w:pPr>
+      <w:r>
+        <w:rPr>
+          <w:rFonts w:ascii="Times New Roman" w:hAnsi="Times New Roman" w:cs="Times New Roman"/>
+          <w:sz w:val="20"/>
+          <w:szCs w:val="20"/>
+          <w:lang w:eastAsia="zh-CN"/>
+        </w:rPr>
+        <w:t>The CSM, and the Client Modules each have a Connection Handler which determines what message should be sent, and the logic of what to do on receiving a message</w:t>
       </w:r>
     </w:p>
     <w:p>
@@ -8663,6 +8888,26 @@
           <w:lang w:eastAsia="zh-CN"/>
         </w:rPr>
         <w:tab/>
+      </w:r>
+      <w:proofErr w:type="spellStart"/>
+      <w:r>
+        <w:rPr>
+          <w:rFonts w:ascii="Times New Roman" w:hAnsi="Times New Roman" w:cs="Times New Roman"/>
+          <w:color w:val="000000" w:themeColor="text1"/>
+          <w:sz w:val="20"/>
+          <w:szCs w:val="20"/>
+          <w:lang w:eastAsia="zh-CN"/>
+        </w:rPr>
+        <w:t>Text</w:t>
+      </w:r>
+      <w:r>
+        <w:rPr>
+          <w:rFonts w:ascii="Times New Roman" w:hAnsi="Times New Roman" w:cs="Times New Roman"/>
+          <w:color w:val="000000" w:themeColor="text1"/>
+          <w:sz w:val="20"/>
+          <w:szCs w:val="20"/>
+          <w:lang w:eastAsia="zh-CN"/>
+        </w:rPr>
         <w:t>M</w:t>
       </w:r>
       <w:r>
@@ -8673,7 +8918,18 @@
           <w:szCs w:val="20"/>
           <w:lang w:eastAsia="zh-CN"/>
         </w:rPr>
-        <w:t>essage order shall be banned to modify.</w:t>
+        <w:t>essage</w:t>
+      </w:r>
+      <w:proofErr w:type="spellEnd"/>
+      <w:r>
+        <w:rPr>
+          <w:rFonts w:ascii="Times New Roman" w:hAnsi="Times New Roman" w:cs="Times New Roman" w:hint="eastAsia"/>
+          <w:color w:val="000000" w:themeColor="text1"/>
+          <w:sz w:val="20"/>
+          <w:szCs w:val="20"/>
+          <w:lang w:eastAsia="zh-CN"/>
+        </w:rPr>
+        <w:t xml:space="preserve"> order shall be banned to modify.</w:t>
       </w:r>
     </w:p>
     <w:p>
@@ -8718,6 +8974,17 @@
         </w:rPr>
         <w:tab/>
       </w:r>
+      <w:proofErr w:type="spellStart"/>
+      <w:r>
+        <w:rPr>
+          <w:rFonts w:ascii="Times New Roman" w:hAnsi="Times New Roman" w:cs="Times New Roman"/>
+          <w:color w:val="000000" w:themeColor="text1"/>
+          <w:sz w:val="20"/>
+          <w:szCs w:val="20"/>
+          <w:lang w:eastAsia="zh-CN"/>
+        </w:rPr>
+        <w:t>Text</w:t>
+      </w:r>
       <w:r>
         <w:rPr>
           <w:rFonts w:ascii="Times New Roman" w:hAnsi="Times New Roman" w:cs="Times New Roman" w:hint="eastAsia"/>
@@ -8726,7 +8993,28 @@
           <w:szCs w:val="20"/>
           <w:lang w:eastAsia="zh-CN"/>
         </w:rPr>
-        <w:t xml:space="preserve">Message sent shall be banned </w:t>
+        <w:t>Message</w:t>
+      </w:r>
+      <w:r>
+        <w:rPr>
+          <w:rFonts w:ascii="Times New Roman" w:hAnsi="Times New Roman" w:cs="Times New Roman"/>
+          <w:color w:val="000000" w:themeColor="text1"/>
+          <w:sz w:val="20"/>
+          <w:szCs w:val="20"/>
+          <w:lang w:eastAsia="zh-CN"/>
+        </w:rPr>
+        <w:t>s</w:t>
+      </w:r>
+      <w:proofErr w:type="spellEnd"/>
+      <w:r>
+        <w:rPr>
+          <w:rFonts w:ascii="Times New Roman" w:hAnsi="Times New Roman" w:cs="Times New Roman" w:hint="eastAsia"/>
+          <w:color w:val="000000" w:themeColor="text1"/>
+          <w:sz w:val="20"/>
+          <w:szCs w:val="20"/>
+          <w:lang w:eastAsia="zh-CN"/>
+        </w:rPr>
+        <w:t xml:space="preserve"> sent shall be banned </w:t>
       </w:r>
       <w:r>
         <w:rPr>
@@ -9164,6 +9452,17 @@
         </w:rPr>
         <w:tab/>
       </w:r>
+      <w:proofErr w:type="spellStart"/>
+      <w:r>
+        <w:rPr>
+          <w:rFonts w:ascii="Times New Roman" w:hAnsi="Times New Roman" w:cs="Times New Roman"/>
+          <w:color w:val="000000" w:themeColor="text1"/>
+          <w:sz w:val="20"/>
+          <w:szCs w:val="20"/>
+          <w:lang w:eastAsia="zh-CN"/>
+        </w:rPr>
+        <w:t>Text</w:t>
+      </w:r>
       <w:r>
         <w:rPr>
           <w:rFonts w:ascii="Times New Roman" w:hAnsi="Times New Roman" w:cs="Times New Roman" w:hint="eastAsia"/>
@@ -9172,7 +9471,18 @@
           <w:szCs w:val="20"/>
           <w:lang w:eastAsia="zh-CN"/>
         </w:rPr>
-        <w:t xml:space="preserve">Message delivery time shall </w:t>
+        <w:t>Message</w:t>
+      </w:r>
+      <w:proofErr w:type="spellEnd"/>
+      <w:r>
+        <w:rPr>
+          <w:rFonts w:ascii="Times New Roman" w:hAnsi="Times New Roman" w:cs="Times New Roman" w:hint="eastAsia"/>
+          <w:color w:val="000000" w:themeColor="text1"/>
+          <w:sz w:val="20"/>
+          <w:szCs w:val="20"/>
+          <w:lang w:eastAsia="zh-CN"/>
+        </w:rPr>
+        <w:t xml:space="preserve"> delivery time shall </w:t>
       </w:r>
       <w:r>
         <w:rPr>

</xml_diff>